<commit_message>
build: regeneración completa del sitio web
- Renderizados todos los documentos (HTML, PDF, DOCX)
- Actualizados assets CSS y JS
- Optimizados archivos de búsqueda y sitemap
</commit_message>
<xml_diff>
--- a/_site/inteligencia-comercial/2025-05-15-herramientas-y-plataformas-de-comercio-internacional/index.docx
+++ b/_site/inteligencia-comercial/2025-05-15-herramientas-y-plataformas-de-comercio-internacional/index.docx
@@ -44,7 +44,7 @@
         <w:t xml:space="preserve"> </w:t>
       </w:r>
     </w:p>
-    <w:bookmarkStart w:id="20" w:name="title"/>
+    <w:bookmarkStart w:id="22" w:name="title"/>
     <w:p>
       <w:pPr>
         <w:pStyle w:val="Heading1"/>
@@ -93,8 +93,8 @@
         <w:t xml:space="preserve"> </w:t>
       </w:r>
     </w:p>
-    <w:bookmarkEnd w:id="20"/>
-    <w:bookmarkStart w:id="24" w:name="author-note"/>
+    <w:bookmarkEnd w:id="22"/>
+    <w:bookmarkStart w:id="26" w:name="author-note"/>
     <w:p>
       <w:pPr>
         <w:pStyle w:val="Heading1"/>
@@ -113,15 +113,15 @@
       <w:r>
         <w:t xml:space="preserve"> </w:t>
       </w:r>
-      <w:bookmarkStart w:id="21" w:name="orchid"/>
+      <w:bookmarkStart w:id="23" w:name="orchid"/>
       <w:r>
         <w:t xml:space="preserve">Orcid ID Logo: A green circle with white letters ID</w:t>
       </w:r>
-      <w:bookmarkEnd w:id="21"/>
+      <w:bookmarkEnd w:id="23"/>
       <w:r>
         <w:t xml:space="preserve"> </w:t>
       </w:r>
-      <w:hyperlink r:id="rId22">
+      <w:hyperlink r:id="rId24">
         <w:r>
           <w:rPr>
             <w:rStyle w:val="Hyperlink"/>
@@ -160,7 +160,7 @@
         <w:t xml:space="preserve">: </w:t>
       </w:r>
       <w:r>
-        <w:t xml:space="preserve">conceptualización y redacción</w:t>
+        <w:t xml:space="preserve">conceptualización, metodología, análisis formal, investigación, recursos, curación de datos, redacción, visualización, supervisión, y administración del proyecto</w:t>
       </w:r>
     </w:p>
     <w:p>
@@ -168,12 +168,12 @@
         <w:pStyle w:val="BodyText"/>
       </w:pPr>
       <w:r>
-        <w:t xml:space="preserve">La correspondencia relativa a este artículo debe dirigirse a Edison Achalma, Escuela Profesional de Economía, Universidad Nacional de San Cristóbal de Huamanga, Ayacucho, AYA, Perú, Email:</w:t>
+        <w:t xml:space="preserve">La correspondencia relativa a este artículo debe dirigirse a Edison Achalma, Escuela Profesional de Economía, Universidad Nacional de San Cristóbal de Huamanga, Portal Independencia N° 57, Ayacucho, AYA 5001, Perú, Email:</w:t>
       </w:r>
       <w:r>
         <w:t xml:space="preserve"> </w:t>
       </w:r>
-      <w:hyperlink r:id="rId23">
+      <w:hyperlink r:id="rId25">
         <w:r>
           <w:rPr>
             <w:rStyle w:val="Hyperlink"/>
@@ -187,8 +187,8 @@
         <w:br w:type="page"/>
       </w:r>
     </w:p>
-    <w:bookmarkEnd w:id="24"/>
-    <w:bookmarkStart w:id="25" w:name="abstract"/>
+    <w:bookmarkEnd w:id="26"/>
+    <w:bookmarkStart w:id="27" w:name="abstract"/>
     <w:p>
       <w:pPr>
         <w:pStyle w:val="Heading1"/>
@@ -225,8 +225,8 @@
         <w:br w:type="page"/>
       </w:r>
     </w:p>
-    <w:bookmarkEnd w:id="25"/>
-    <w:bookmarkStart w:id="26" w:name="firstheader"/>
+    <w:bookmarkEnd w:id="27"/>
+    <w:bookmarkStart w:id="28" w:name="firstheader"/>
     <w:p>
       <w:pPr>
         <w:pStyle w:val="Heading1"/>
@@ -235,8 +235,8 @@
         <w:t xml:space="preserve">Herramientas clave en comercio internacional</w:t>
       </w:r>
     </w:p>
-    <w:bookmarkEnd w:id="26"/>
-    <w:bookmarkStart w:id="38" w:name="plataformas-de-inteligencia-comercial"/>
+    <w:bookmarkEnd w:id="28"/>
+    <w:bookmarkStart w:id="40" w:name="plataformas-de-inteligencia-comercial"/>
     <w:p>
       <w:pPr>
         <w:pStyle w:val="Heading1"/>
@@ -253,7 +253,7 @@
           <w:numId w:val="1001"/>
         </w:numPr>
       </w:pPr>
-      <w:hyperlink r:id="rId27">
+      <w:hyperlink r:id="rId29">
         <w:r>
           <w:rPr>
             <w:rStyle w:val="Hyperlink"/>
@@ -270,7 +270,7 @@
           <w:numId w:val="1001"/>
         </w:numPr>
       </w:pPr>
-      <w:hyperlink r:id="rId28">
+      <w:hyperlink r:id="rId30">
         <w:r>
           <w:rPr>
             <w:rStyle w:val="Hyperlink"/>
@@ -287,7 +287,7 @@
           <w:numId w:val="1001"/>
         </w:numPr>
       </w:pPr>
-      <w:hyperlink r:id="rId29">
+      <w:hyperlink r:id="rId31">
         <w:r>
           <w:rPr>
             <w:rStyle w:val="Hyperlink"/>
@@ -304,7 +304,7 @@
           <w:numId w:val="1001"/>
         </w:numPr>
       </w:pPr>
-      <w:hyperlink r:id="rId30">
+      <w:hyperlink r:id="rId32">
         <w:r>
           <w:rPr>
             <w:rStyle w:val="Hyperlink"/>
@@ -321,7 +321,7 @@
           <w:numId w:val="1001"/>
         </w:numPr>
       </w:pPr>
-      <w:hyperlink r:id="rId31">
+      <w:hyperlink r:id="rId33">
         <w:r>
           <w:rPr>
             <w:rStyle w:val="Hyperlink"/>
@@ -338,7 +338,7 @@
           <w:numId w:val="1001"/>
         </w:numPr>
       </w:pPr>
-      <w:hyperlink r:id="rId32">
+      <w:hyperlink r:id="rId34">
         <w:r>
           <w:rPr>
             <w:rStyle w:val="Hyperlink"/>
@@ -355,7 +355,7 @@
           <w:numId w:val="1001"/>
         </w:numPr>
       </w:pPr>
-      <w:hyperlink r:id="rId33">
+      <w:hyperlink r:id="rId35">
         <w:r>
           <w:rPr>
             <w:rStyle w:val="Hyperlink"/>
@@ -372,7 +372,7 @@
           <w:numId w:val="1001"/>
         </w:numPr>
       </w:pPr>
-      <w:hyperlink r:id="rId34">
+      <w:hyperlink r:id="rId36">
         <w:r>
           <w:rPr>
             <w:rStyle w:val="Hyperlink"/>
@@ -389,7 +389,7 @@
           <w:numId w:val="1001"/>
         </w:numPr>
       </w:pPr>
-      <w:hyperlink r:id="rId35">
+      <w:hyperlink r:id="rId37">
         <w:r>
           <w:rPr>
             <w:rStyle w:val="Hyperlink"/>
@@ -406,7 +406,7 @@
           <w:numId w:val="1001"/>
         </w:numPr>
       </w:pPr>
-      <w:hyperlink r:id="rId36">
+      <w:hyperlink r:id="rId38">
         <w:r>
           <w:rPr>
             <w:rStyle w:val="Hyperlink"/>
@@ -423,7 +423,7 @@
           <w:numId w:val="1001"/>
         </w:numPr>
       </w:pPr>
-      <w:hyperlink r:id="rId37">
+      <w:hyperlink r:id="rId39">
         <w:r>
           <w:rPr>
             <w:rStyle w:val="Hyperlink"/>
@@ -432,8 +432,8 @@
         </w:r>
       </w:hyperlink>
     </w:p>
-    <w:bookmarkEnd w:id="38"/>
-    <w:bookmarkStart w:id="58" w:name="comercio-y-exportación-en-perú"/>
+    <w:bookmarkEnd w:id="40"/>
+    <w:bookmarkStart w:id="60" w:name="comercio-y-exportación-en-perú"/>
     <w:p>
       <w:pPr>
         <w:pStyle w:val="Heading1"/>
@@ -450,7 +450,7 @@
           <w:numId w:val="1002"/>
         </w:numPr>
       </w:pPr>
-      <w:hyperlink r:id="rId39">
+      <w:hyperlink r:id="rId41">
         <w:r>
           <w:rPr>
             <w:rStyle w:val="Hyperlink"/>
@@ -467,7 +467,7 @@
           <w:numId w:val="1002"/>
         </w:numPr>
       </w:pPr>
-      <w:hyperlink r:id="rId40">
+      <w:hyperlink r:id="rId42">
         <w:r>
           <w:rPr>
             <w:rStyle w:val="Hyperlink"/>
@@ -484,7 +484,7 @@
           <w:numId w:val="1002"/>
         </w:numPr>
       </w:pPr>
-      <w:hyperlink r:id="rId41">
+      <w:hyperlink r:id="rId43">
         <w:r>
           <w:rPr>
             <w:rStyle w:val="Hyperlink"/>
@@ -501,7 +501,7 @@
           <w:numId w:val="1002"/>
         </w:numPr>
       </w:pPr>
-      <w:hyperlink r:id="rId42">
+      <w:hyperlink r:id="rId44">
         <w:r>
           <w:rPr>
             <w:rStyle w:val="Hyperlink"/>
@@ -518,7 +518,7 @@
           <w:numId w:val="1002"/>
         </w:numPr>
       </w:pPr>
-      <w:hyperlink r:id="rId43">
+      <w:hyperlink r:id="rId45">
         <w:r>
           <w:rPr>
             <w:rStyle w:val="Hyperlink"/>
@@ -535,7 +535,7 @@
           <w:numId w:val="1002"/>
         </w:numPr>
       </w:pPr>
-      <w:hyperlink r:id="rId44">
+      <w:hyperlink r:id="rId46">
         <w:r>
           <w:rPr>
             <w:rStyle w:val="Hyperlink"/>
@@ -552,7 +552,7 @@
           <w:numId w:val="1002"/>
         </w:numPr>
       </w:pPr>
-      <w:hyperlink r:id="rId45">
+      <w:hyperlink r:id="rId47">
         <w:r>
           <w:rPr>
             <w:rStyle w:val="Hyperlink"/>
@@ -569,7 +569,7 @@
           <w:numId w:val="1002"/>
         </w:numPr>
       </w:pPr>
-      <w:hyperlink r:id="rId46">
+      <w:hyperlink r:id="rId48">
         <w:r>
           <w:rPr>
             <w:rStyle w:val="Hyperlink"/>
@@ -586,7 +586,7 @@
           <w:numId w:val="1002"/>
         </w:numPr>
       </w:pPr>
-      <w:hyperlink r:id="rId47">
+      <w:hyperlink r:id="rId49">
         <w:r>
           <w:rPr>
             <w:rStyle w:val="Hyperlink"/>
@@ -603,7 +603,7 @@
           <w:numId w:val="1002"/>
         </w:numPr>
       </w:pPr>
-      <w:hyperlink r:id="rId48">
+      <w:hyperlink r:id="rId50">
         <w:r>
           <w:rPr>
             <w:rStyle w:val="Hyperlink"/>
@@ -620,7 +620,7 @@
           <w:numId w:val="1002"/>
         </w:numPr>
       </w:pPr>
-      <w:hyperlink r:id="rId49">
+      <w:hyperlink r:id="rId51">
         <w:r>
           <w:rPr>
             <w:rStyle w:val="Hyperlink"/>
@@ -637,7 +637,7 @@
           <w:numId w:val="1002"/>
         </w:numPr>
       </w:pPr>
-      <w:hyperlink r:id="rId50">
+      <w:hyperlink r:id="rId52">
         <w:r>
           <w:rPr>
             <w:rStyle w:val="Hyperlink"/>
@@ -654,7 +654,7 @@
           <w:numId w:val="1002"/>
         </w:numPr>
       </w:pPr>
-      <w:hyperlink r:id="rId51">
+      <w:hyperlink r:id="rId53">
         <w:r>
           <w:rPr>
             <w:rStyle w:val="Hyperlink"/>
@@ -671,7 +671,7 @@
           <w:numId w:val="1002"/>
         </w:numPr>
       </w:pPr>
-      <w:hyperlink r:id="rId52">
+      <w:hyperlink r:id="rId54">
         <w:r>
           <w:rPr>
             <w:rStyle w:val="Hyperlink"/>
@@ -688,7 +688,7 @@
           <w:numId w:val="1002"/>
         </w:numPr>
       </w:pPr>
-      <w:hyperlink r:id="rId53">
+      <w:hyperlink r:id="rId55">
         <w:r>
           <w:rPr>
             <w:rStyle w:val="Hyperlink"/>
@@ -705,7 +705,7 @@
           <w:numId w:val="1002"/>
         </w:numPr>
       </w:pPr>
-      <w:hyperlink r:id="rId54">
+      <w:hyperlink r:id="rId56">
         <w:r>
           <w:rPr>
             <w:rStyle w:val="Hyperlink"/>
@@ -722,7 +722,7 @@
           <w:numId w:val="1002"/>
         </w:numPr>
       </w:pPr>
-      <w:hyperlink r:id="rId55">
+      <w:hyperlink r:id="rId57">
         <w:r>
           <w:rPr>
             <w:rStyle w:val="Hyperlink"/>
@@ -739,7 +739,7 @@
           <w:numId w:val="1002"/>
         </w:numPr>
       </w:pPr>
-      <w:hyperlink r:id="rId56">
+      <w:hyperlink r:id="rId58">
         <w:r>
           <w:rPr>
             <w:rStyle w:val="Hyperlink"/>
@@ -756,7 +756,7 @@
           <w:numId w:val="1002"/>
         </w:numPr>
       </w:pPr>
-      <w:hyperlink r:id="rId57">
+      <w:hyperlink r:id="rId59">
         <w:r>
           <w:rPr>
             <w:rStyle w:val="Hyperlink"/>
@@ -765,8 +765,8 @@
         </w:r>
       </w:hyperlink>
     </w:p>
-    <w:bookmarkEnd w:id="58"/>
-    <w:bookmarkStart w:id="66" w:name="normas-reglamentos-y-requisitos-técnicos"/>
+    <w:bookmarkEnd w:id="60"/>
+    <w:bookmarkStart w:id="68" w:name="normas-reglamentos-y-requisitos-técnicos"/>
     <w:p>
       <w:pPr>
         <w:pStyle w:val="Heading1"/>
@@ -783,7 +783,7 @@
           <w:numId w:val="1003"/>
         </w:numPr>
       </w:pPr>
-      <w:hyperlink r:id="rId59">
+      <w:hyperlink r:id="rId61">
         <w:r>
           <w:rPr>
             <w:rStyle w:val="Hyperlink"/>
@@ -800,7 +800,7 @@
           <w:numId w:val="1003"/>
         </w:numPr>
       </w:pPr>
-      <w:hyperlink r:id="rId60">
+      <w:hyperlink r:id="rId62">
         <w:r>
           <w:rPr>
             <w:rStyle w:val="Hyperlink"/>
@@ -817,7 +817,7 @@
           <w:numId w:val="1003"/>
         </w:numPr>
       </w:pPr>
-      <w:hyperlink r:id="rId61">
+      <w:hyperlink r:id="rId63">
         <w:r>
           <w:rPr>
             <w:rStyle w:val="Hyperlink"/>
@@ -834,7 +834,7 @@
           <w:numId w:val="1003"/>
         </w:numPr>
       </w:pPr>
-      <w:hyperlink r:id="rId62">
+      <w:hyperlink r:id="rId64">
         <w:r>
           <w:rPr>
             <w:rStyle w:val="Hyperlink"/>
@@ -851,7 +851,7 @@
           <w:numId w:val="1003"/>
         </w:numPr>
       </w:pPr>
-      <w:hyperlink r:id="rId63">
+      <w:hyperlink r:id="rId65">
         <w:r>
           <w:rPr>
             <w:rStyle w:val="Hyperlink"/>
@@ -868,7 +868,7 @@
           <w:numId w:val="1003"/>
         </w:numPr>
       </w:pPr>
-      <w:hyperlink r:id="rId64">
+      <w:hyperlink r:id="rId66">
         <w:r>
           <w:rPr>
             <w:rStyle w:val="Hyperlink"/>
@@ -885,7 +885,7 @@
           <w:numId w:val="1003"/>
         </w:numPr>
       </w:pPr>
-      <w:hyperlink r:id="rId65">
+      <w:hyperlink r:id="rId67">
         <w:r>
           <w:rPr>
             <w:rStyle w:val="Hyperlink"/>
@@ -894,8 +894,8 @@
         </w:r>
       </w:hyperlink>
     </w:p>
-    <w:bookmarkEnd w:id="66"/>
-    <w:bookmarkStart w:id="71" w:name="mapas-y-herramientas-especializadas"/>
+    <w:bookmarkEnd w:id="68"/>
+    <w:bookmarkStart w:id="73" w:name="mapas-y-herramientas-especializadas"/>
     <w:p>
       <w:pPr>
         <w:pStyle w:val="Heading1"/>
@@ -912,7 +912,7 @@
           <w:numId w:val="1004"/>
         </w:numPr>
       </w:pPr>
-      <w:hyperlink r:id="rId67">
+      <w:hyperlink r:id="rId69">
         <w:r>
           <w:rPr>
             <w:rStyle w:val="Hyperlink"/>
@@ -929,7 +929,7 @@
           <w:numId w:val="1004"/>
         </w:numPr>
       </w:pPr>
-      <w:hyperlink r:id="rId68">
+      <w:hyperlink r:id="rId70">
         <w:r>
           <w:rPr>
             <w:rStyle w:val="Hyperlink"/>
@@ -946,7 +946,7 @@
           <w:numId w:val="1004"/>
         </w:numPr>
       </w:pPr>
-      <w:hyperlink r:id="rId69">
+      <w:hyperlink r:id="rId71">
         <w:r>
           <w:rPr>
             <w:rStyle w:val="Hyperlink"/>
@@ -963,7 +963,7 @@
           <w:numId w:val="1004"/>
         </w:numPr>
       </w:pPr>
-      <w:hyperlink r:id="rId70">
+      <w:hyperlink r:id="rId72">
         <w:r>
           <w:rPr>
             <w:rStyle w:val="Hyperlink"/>
@@ -972,8 +972,8 @@
         </w:r>
       </w:hyperlink>
     </w:p>
-    <w:bookmarkEnd w:id="71"/>
-    <w:bookmarkStart w:id="74" w:name="alertas-y-regulaciones-internacionales"/>
+    <w:bookmarkEnd w:id="73"/>
+    <w:bookmarkStart w:id="76" w:name="alertas-y-regulaciones-internacionales"/>
     <w:p>
       <w:pPr>
         <w:pStyle w:val="Heading1"/>
@@ -990,7 +990,7 @@
           <w:numId w:val="1005"/>
         </w:numPr>
       </w:pPr>
-      <w:hyperlink r:id="rId72">
+      <w:hyperlink r:id="rId74">
         <w:r>
           <w:rPr>
             <w:rStyle w:val="Hyperlink"/>
@@ -1007,7 +1007,7 @@
           <w:numId w:val="1005"/>
         </w:numPr>
       </w:pPr>
-      <w:hyperlink r:id="rId73">
+      <w:hyperlink r:id="rId75">
         <w:r>
           <w:rPr>
             <w:rStyle w:val="Hyperlink"/>
@@ -1016,8 +1016,8 @@
         </w:r>
       </w:hyperlink>
     </w:p>
-    <w:bookmarkEnd w:id="74"/>
-    <w:bookmarkStart w:id="77" w:name="publicaciones-similares"/>
+    <w:bookmarkEnd w:id="76"/>
+    <w:bookmarkStart w:id="79" w:name="publicaciones-similares"/>
     <w:p>
       <w:pPr>
         <w:pStyle w:val="Heading1"/>
@@ -1042,11 +1042,11 @@
           <w:numId w:val="1006"/>
         </w:numPr>
       </w:pPr>
-      <w:hyperlink r:id="rId75"/>
+      <w:hyperlink r:id="rId77"/>
       <w:r>
         <w:t xml:space="preserve"> </w:t>
       </w:r>
-      <w:hyperlink r:id="rId76">
+      <w:hyperlink r:id="rId78">
         <w:r>
           <w:rPr>
             <w:rStyle w:val="Hyperlink"/>
@@ -1063,14 +1063,14 @@
         <w:t xml:space="preserve">Esperamos que encuentres estas publicaciones igualmente interesantes y útiles. ¡Disfruta de la lectura!</w:t>
       </w:r>
     </w:p>
-    <w:bookmarkEnd w:id="77"/>
+    <w:bookmarkEnd w:id="79"/>
     <w:sectPr>
-      <w:headerReference r:id="rId9" w:type="even"/>
-      <w:headerReference r:id="rId11" w:type="default"/>
-      <w:footerReference r:id="rId14" w:type="even"/>
-      <w:footerReference r:id="rId13" w:type="default"/>
-      <w:headerReference r:id="rId10" w:type="first"/>
-      <w:footerReference r:id="rId12" w:type="first"/>
+      <w:headerReference r:id="rId8" w:type="even"/>
+      <w:headerReference r:id="rId9" w:type="default"/>
+      <w:footerReference r:id="rId10" w:type="even"/>
+      <w:footerReference r:id="rId11" w:type="default"/>
+      <w:headerReference r:id="rId12" w:type="first"/>
+      <w:footerReference r:id="rId13" w:type="first"/>
       <w:pgSz w:h="15840" w:w="12240"/>
       <w:pgMar w:bottom="1440" w:footer="720" w:gutter="0" w:header="720" w:left="1440" w:right="1440" w:top="1440"/>
       <w:cols w:space="720"/>

</xml_diff>